<commit_message>
changing the codebase to ubuntu
</commit_message>
<xml_diff>
--- a/API DOCS/Auth Integration.docx
+++ b/API DOCS/Auth Integration.docx
@@ -915,6 +915,8 @@
         </w:rPr>
         <w:t xml:space="preserve"> Sync Endpoint</w:t>
       </w:r>
+      <w:bookmarkStart w:id="0" w:name="_GoBack"/>
+      <w:bookmarkEnd w:id="0"/>
     </w:p>
     <w:p>
       <w:pPr>
@@ -938,10 +940,36 @@
           <w:szCs w:val="27"/>
           <w:lang w:eastAsia="en-IN"/>
         </w:rPr>
-        <w:t>BASE URL: https://api.wostup.com</w:t>
-      </w:r>
-      <w:bookmarkStart w:id="0" w:name="_GoBack"/>
-      <w:bookmarkEnd w:id="0"/>
+        <w:t xml:space="preserve">BASE URL: </w:t>
+      </w:r>
+      <w:hyperlink r:id="rId5" w:history="1">
+        <w:r>
+          <w:rPr>
+            <w:rStyle w:val="Hyperlink"/>
+            <w:rFonts w:ascii="Times New Roman" w:eastAsia="Times New Roman" w:hAnsi="Times New Roman" w:cs="Times New Roman"/>
+            <w:b/>
+            <w:bCs/>
+            <w:sz w:val="27"/>
+            <w:szCs w:val="27"/>
+            <w:lang w:eastAsia="en-IN"/>
+          </w:rPr>
+          <w:t>https://api.wostup.com</w:t>
+        </w:r>
+      </w:hyperlink>
+    </w:p>
+    <w:p>
+      <w:pPr>
+        <w:spacing w:before="100" w:beforeAutospacing="1" w:after="100" w:afterAutospacing="1" w:line="240" w:lineRule="auto"/>
+        <w:outlineLvl w:val="2"/>
+        <w:rPr>
+          <w:rFonts w:ascii="Times New Roman" w:eastAsia="Times New Roman" w:hAnsi="Times New Roman" w:cs="Times New Roman"/>
+          <w:b/>
+          <w:bCs/>
+          <w:sz w:val="27"/>
+          <w:szCs w:val="27"/>
+          <w:lang w:eastAsia="en-IN"/>
+        </w:rPr>
+      </w:pPr>
     </w:p>
     <w:p>
       <w:pPr>
@@ -1377,6 +1405,7 @@
           <w:szCs w:val="24"/>
           <w:lang w:eastAsia="en-IN"/>
         </w:rPr>
+        <w:lastRenderedPageBreak/>
         <w:t>JSON</w:t>
       </w:r>
     </w:p>
@@ -1416,7 +1445,6 @@
           <w:szCs w:val="20"/>
           <w:lang w:eastAsia="en-IN"/>
         </w:rPr>
-        <w:lastRenderedPageBreak/>
         <w:t>{</w:t>
       </w:r>
     </w:p>
@@ -3439,6 +3467,7 @@
           <w:szCs w:val="24"/>
           <w:lang w:eastAsia="en-IN"/>
         </w:rPr>
+        <w:lastRenderedPageBreak/>
         <w:t>Authentication:</w:t>
       </w:r>
       <w:r>
@@ -3512,7 +3541,6 @@
           <w:szCs w:val="24"/>
           <w:lang w:eastAsia="en-IN"/>
         </w:rPr>
-        <w:lastRenderedPageBreak/>
         <w:t>Description:</w:t>
       </w:r>
       <w:r>
@@ -7568,6 +7596,17 @@
       <w:bCs/>
     </w:rPr>
   </w:style>
+  <w:style w:type="character" w:styleId="Hyperlink">
+    <w:name w:val="Hyperlink"/>
+    <w:basedOn w:val="DefaultParagraphFont"/>
+    <w:uiPriority w:val="99"/>
+    <w:unhideWhenUsed/>
+    <w:rsid w:val="00CC1B91"/>
+    <w:rPr>
+      <w:color w:val="0563C1" w:themeColor="hyperlink"/>
+      <w:u w:val="single"/>
+    </w:rPr>
+  </w:style>
 </w:styles>
 </file>
 

</xml_diff>